<commit_message>
Retrofit Hebrew-inline pairings in 2026-09-06 and 2026-09-07 English HTMLs (31 + 71 pairings); rebuild DOCXs
</commit_message>
<xml_diff>
--- a/2026-09-06 — The Final Mincha, אֲחוֹת קְטַנָּה, and the Chofetz Chaim's Primordial Oath.docx
+++ b/2026-09-06 — The Final Mincha, אֲחוֹת קְטַנָּה, and the Chofetz Chaim's Primordial Oath.docx
@@ -122,11 +122,10 @@
       </w:r>
       <w:r>
         <w:rPr>
-          <w:rFonts w:ascii="David" w:hAnsi="David"/>
           <w:i/>
           <w:color w:val="3B3B3B"/>
         </w:rPr>
-        <w:t xml:space="preserve"> the first ma'ariv of ראש השנה, but the מנחה that ends the year that just was. From there the shiur moves through אֲחוֹת קְטַנָּה (the </w:t>
+        <w:t xml:space="preserve"> the first ma'ariv (</w:t>
       </w:r>
       <w:r>
         <w:rPr>
@@ -134,7 +133,7 @@
           <w:i/>
           <w:color w:val="3B3B3B"/>
         </w:rPr>
-        <w:t>ספרדי</w:t>
+        <w:t>מַעֲרִיב</w:t>
       </w:r>
       <w:r>
         <w:rPr>
@@ -142,7 +141,7 @@
           <w:i/>
           <w:color w:val="3B3B3B"/>
         </w:rPr>
-        <w:t xml:space="preserve"> transition-piyut composed by a contemporary of the רמב"ן), the אריז"ל's סגולה of לְדָוִד מִזְמוֹר and the divine name </w:t>
+        <w:t xml:space="preserve">) of ראש השנה, but the מנחה that ends the year that just was. From there the shiur moves through אֲחוֹת קְטַנָּה (the </w:t>
       </w:r>
       <w:r>
         <w:rPr>
@@ -150,14 +149,60 @@
           <w:i/>
           <w:color w:val="3B3B3B"/>
         </w:rPr>
-        <w:t>חת"ך</w:t>
+        <w:t>ספרדי</w:t>
       </w:r>
       <w:r>
         <w:rPr>
           <w:i/>
           <w:color w:val="3B3B3B"/>
         </w:rPr>
-        <w:t xml:space="preserve">, the Chofetz Chaim's chiddush that </w:t>
+        <w:t xml:space="preserve"> transition-piyut (</w:t>
+      </w:r>
+      <w:r>
+        <w:rPr>
+          <w:rFonts w:ascii="David" w:hAnsi="David"/>
+          <w:i/>
+          <w:color w:val="3B3B3B"/>
+        </w:rPr>
+        <w:t>פִּיּוּט</w:t>
+      </w:r>
+      <w:r>
+        <w:rPr>
+          <w:rFonts w:ascii="David" w:hAnsi="David"/>
+          <w:i/>
+          <w:color w:val="3B3B3B"/>
+        </w:rPr>
+        <w:t xml:space="preserve">) composed by a contemporary of the רמב"ן), the אריז"ל's סגולה of לְדָוִד מִזְמוֹר and the divine name </w:t>
+      </w:r>
+      <w:r>
+        <w:rPr>
+          <w:rFonts w:ascii="David" w:hAnsi="David"/>
+          <w:i/>
+          <w:color w:val="3B3B3B"/>
+        </w:rPr>
+        <w:t>חת"ך</w:t>
+      </w:r>
+      <w:r>
+        <w:rPr>
+          <w:i/>
+          <w:color w:val="3B3B3B"/>
+        </w:rPr>
+        <w:t>, the Chofetz Chaim's chiddush (</w:t>
+      </w:r>
+      <w:r>
+        <w:rPr>
+          <w:rFonts w:ascii="David" w:hAnsi="David"/>
+          <w:i/>
+          <w:color w:val="3B3B3B"/>
+        </w:rPr>
+        <w:t>חִידּוּשׁ</w:t>
+      </w:r>
+      <w:r>
+        <w:rPr>
+          <w:i/>
+          <w:color w:val="3B3B3B"/>
+        </w:rPr>
+        <w:t xml:space="preserve">) that </w:t>
       </w:r>
       <w:r>
         <w:rPr>
@@ -246,7 +291,20 @@
           <w:rFonts w:ascii="David" w:hAnsi="David"/>
           <w:i/>
         </w:rPr>
-        <w:t>"What would we do without the משנה ברורה? What would we do without all of his heilige seforim?"</w:t>
+        <w:t>"What would we do without the משנה ברורה? What would we do without all of his heilige seforim (</w:t>
+      </w:r>
+      <w:r>
+        <w:rPr>
+          <w:rFonts w:ascii="David" w:hAnsi="David"/>
+          <w:i/>
+        </w:rPr>
+        <w:t>ספרים</w:t>
+      </w:r>
+      <w:r>
+        <w:rPr>
+          <w:i/>
+        </w:rPr>
+        <w:t>)?"</w:t>
       </w:r>
       <w:r>
         <w:rPr>
@@ -258,7 +316,20 @@
         <w:rPr>
           <w:i/>
         </w:rPr>
-        <w:t>madgish</w:t>
+        <w:t>madgish (</w:t>
+      </w:r>
+      <w:r>
+        <w:rPr>
+          <w:rFonts w:ascii="David" w:hAnsi="David"/>
+          <w:i/>
+        </w:rPr>
+        <w:t>מַדְגִּישׁ</w:t>
+      </w:r>
+      <w:r>
+        <w:rPr>
+          <w:i/>
+        </w:rPr>
+        <w:t>)</w:t>
       </w:r>
       <w:r>
         <w:rPr>
@@ -270,11 +341,32 @@
     </w:p>
     <w:p>
       <w:r>
-        <w:rPr>
-          <w:rFonts w:ascii="David" w:hAnsi="David"/>
-        </w:rPr>
         <w:br/>
-        <w:t xml:space="preserve">  Before that chiddush, however — a whole set of preludes. Because the מחזור does not begin at ma'ariv. It begins with the מנחה that closes the year.</w:t>
+        <w:t xml:space="preserve">  Before that chiddush (</w:t>
+      </w:r>
+      <w:r>
+        <w:rPr>
+          <w:rFonts w:ascii="David" w:hAnsi="David"/>
+        </w:rPr>
+        <w:t>חִידּוּשׁ</w:t>
+      </w:r>
+      <w:r>
+        <w:rPr>
+          <w:rFonts w:ascii="David" w:hAnsi="David"/>
+        </w:rPr>
+        <w:t>), however — a whole set of preludes. Because the מחזור does not begin at ma'ariv (</w:t>
+      </w:r>
+      <w:r>
+        <w:rPr>
+          <w:rFonts w:ascii="David" w:hAnsi="David"/>
+        </w:rPr>
+        <w:t>מַעֲרִיב</w:t>
+      </w:r>
+      <w:r>
+        <w:rPr>
+          <w:rFonts w:ascii="David" w:hAnsi="David"/>
+        </w:rPr>
+        <w:t>). It begins with the מנחה that closes the year.</w:t>
         <w:br/>
       </w:r>
     </w:p>
@@ -808,7 +900,28 @@
           <w:rFonts w:ascii="David" w:hAnsi="David"/>
         </w:rPr>
         <w:br/>
-        <w:t xml:space="preserve">  We say this קאפיטל often; on these nights it carries unusual koach. In some חסידישע circles the minhag is taken very seriously — </w:t>
+        <w:t xml:space="preserve">  We say this קאפיטל often; on these nights it carries unusual koach (</w:t>
+      </w:r>
+      <w:r>
+        <w:rPr>
+          <w:rFonts w:ascii="David" w:hAnsi="David"/>
+        </w:rPr>
+        <w:t>כֹּחַ</w:t>
+      </w:r>
+      <w:r>
+        <w:rPr>
+          <w:rFonts w:ascii="David" w:hAnsi="David"/>
+        </w:rPr>
+        <w:t>). In some חסידישע circles the minhag (</w:t>
+      </w:r>
+      <w:r>
+        <w:rPr>
+          <w:rFonts w:ascii="David" w:hAnsi="David"/>
+        </w:rPr>
+        <w:t>מִנְהָג</w:t>
+      </w:r>
+      <w:r>
+        <w:t xml:space="preserve">) is taken very seriously — </w:t>
       </w:r>
       <w:r>
         <w:rPr>
@@ -879,7 +992,28 @@
           <w:rFonts w:ascii="David" w:hAnsi="David"/>
         </w:rPr>
         <w:br/>
-        <w:t xml:space="preserve">  Reciting לְדָוִד מִזְמוֹר on ראש השנה, with kavvanah, plugs a Yid into the shefa'diker channel of חת"ך. And it comes with responsibility: הקדוש ברוך הוא is </w:t>
+        <w:t xml:space="preserve">  Reciting לְדָוִד מִזְמוֹר on ראש השנה, with kavvanah (</w:t>
+      </w:r>
+      <w:r>
+        <w:rPr>
+          <w:rFonts w:ascii="David" w:hAnsi="David"/>
+        </w:rPr>
+        <w:t>כַּוָּנָה</w:t>
+      </w:r>
+      <w:r>
+        <w:t>), plugs a Yid into the shefa'diker (</w:t>
+      </w:r>
+      <w:r>
+        <w:rPr>
+          <w:rFonts w:ascii="David" w:hAnsi="David"/>
+        </w:rPr>
+        <w:t>שֶׁפַע</w:t>
+      </w:r>
+      <w:r>
+        <w:rPr>
+          <w:rFonts w:ascii="David" w:hAnsi="David"/>
+        </w:rPr>
+        <w:t xml:space="preserve">) channel of חת"ך. And it comes with responsibility: הקדוש ברוך הוא is </w:t>
       </w:r>
       <w:r>
         <w:rPr>
@@ -1024,7 +1158,16 @@
         <w:t>sheine zach</w:t>
       </w:r>
       <w:r>
-        <w:t xml:space="preserve">, the Rav says, when Yidden call with a shaila: </w:t>
+        <w:t>, the Rav says, when Yidden call with a shaila (</w:t>
+      </w:r>
+      <w:r>
+        <w:rPr>
+          <w:rFonts w:ascii="David" w:hAnsi="David"/>
+        </w:rPr>
+        <w:t>שְׁאֵלָה</w:t>
+      </w:r>
+      <w:r>
+        <w:t xml:space="preserve">): </w:t>
       </w:r>
       <w:r>
         <w:rPr>
@@ -1188,7 +1331,19 @@
         <w:rPr>
           <w:rFonts w:ascii="David" w:hAnsi="David"/>
         </w:rPr>
-        <w:t xml:space="preserve"> The נשמה, knowing perfectly well how hard tzaddikus is in this world — takes the שבועה.</w:t>
+        <w:t xml:space="preserve"> The נשמה, knowing perfectly well how hard tzaddikus (</w:t>
+      </w:r>
+      <w:r>
+        <w:rPr>
+          <w:rFonts w:ascii="David" w:hAnsi="David"/>
+        </w:rPr>
+        <w:t>צַדִּיקוּת</w:t>
+      </w:r>
+      <w:r>
+        <w:rPr>
+          <w:rFonts w:ascii="David" w:hAnsi="David"/>
+        </w:rPr>
+        <w:t>) is in this world — takes the שבועה.</w:t>
         <w:br/>
       </w:r>
     </w:p>
@@ -1228,7 +1383,19 @@
         <w:rPr>
           <w:rFonts w:ascii="David" w:hAnsi="David"/>
         </w:rPr>
-        <w:t xml:space="preserve"> שבועה. Every human being took it. To ascend the har of Hashem, one must keep it — must live the life of a tzaddik one committed to before birth. And if a Yid has, חלילה, failed the oath until now — the moment of saying לְדָוִד מִזְמוֹר on ראש השנה is a moment to be </w:t>
+        <w:t xml:space="preserve"> שבועה. Every human being took it. To ascend the har of Hashem, one must keep it — must live the life of a tzaddik (</w:t>
+      </w:r>
+      <w:r>
+        <w:rPr>
+          <w:rFonts w:ascii="David" w:hAnsi="David"/>
+        </w:rPr>
+        <w:t>צַדִּיק</w:t>
+      </w:r>
+      <w:r>
+        <w:rPr>
+          <w:rFonts w:ascii="David" w:hAnsi="David"/>
+        </w:rPr>
+        <w:t xml:space="preserve">) one committed to before birth. And if a Yid has, חלילה, failed the oath until now — the moment of saying לְדָוִד מִזְמוֹר on ראש השנה is a moment to be </w:t>
       </w:r>
       <w:r>
         <w:rPr>
@@ -1262,11 +1429,20 @@
     </w:p>
     <w:p>
       <w:r>
-        <w:rPr>
-          <w:rFonts w:ascii="David" w:hAnsi="David"/>
-        </w:rPr>
         <w:br/>
-        <w:t xml:space="preserve">  A widespread minhag in the עשרת ימי תשובה is to say </w:t>
+        <w:t xml:space="preserve">  A widespread minhag (</w:t>
+      </w:r>
+      <w:r>
+        <w:rPr>
+          <w:rFonts w:ascii="David" w:hAnsi="David"/>
+        </w:rPr>
+        <w:t>מִנְהָג</w:t>
+      </w:r>
+      <w:r>
+        <w:rPr>
+          <w:rFonts w:ascii="David" w:hAnsi="David"/>
+        </w:rPr>
+        <w:t xml:space="preserve">) in the עשרת ימי תשובה is to say </w:t>
       </w:r>
       <w:r>
         <w:rPr>
@@ -1470,11 +1646,20 @@
     </w:p>
     <w:p>
       <w:r>
-        <w:rPr>
-          <w:rFonts w:ascii="David" w:hAnsi="David"/>
-        </w:rPr>
         <w:br/>
-        <w:t xml:space="preserve">  The origin of the minhag to say שיר המעלות מִמַּעֲמַקִּים at this point is the </w:t>
+        <w:t xml:space="preserve">  The origin of the minhag (</w:t>
+      </w:r>
+      <w:r>
+        <w:rPr>
+          <w:rFonts w:ascii="David" w:hAnsi="David"/>
+        </w:rPr>
+        <w:t>מִנְהָג</w:t>
+      </w:r>
+      <w:r>
+        <w:rPr>
+          <w:rFonts w:ascii="David" w:hAnsi="David"/>
+        </w:rPr>
+        <w:t xml:space="preserve">) to say שיר המעלות מִמַּעֲמַקִּים at this point is the </w:t>
       </w:r>
       <w:r>
         <w:rPr>
@@ -1517,7 +1702,16 @@
         <w:t>[13]</w:t>
       </w:r>
       <w:r>
-        <w:t xml:space="preserve"> defends the minhag. His raiya: the </w:t>
+        <w:t xml:space="preserve"> defends the minhag. His raiya (</w:t>
+      </w:r>
+      <w:r>
+        <w:rPr>
+          <w:rFonts w:ascii="David" w:hAnsi="David"/>
+        </w:rPr>
+        <w:t>רְאָיָה</w:t>
+      </w:r>
+      <w:r>
+        <w:t xml:space="preserve">): the </w:t>
       </w:r>
       <w:r>
         <w:rPr>
@@ -1571,10 +1765,19 @@
         <w:t>שִׂיחָה בְּטֵלָה</w:t>
       </w:r>
       <w:r>
-        <w:rPr>
-          <w:rFonts w:ascii="David" w:hAnsi="David"/>
-        </w:rPr>
-        <w:t xml:space="preserve"> — idle chatter. Additional shevachim of the ריבונו של עולם, such as שיר המעלות, are in a different category and are permissible. The klal Yisrael has largely accepted the minhag.</w:t>
+        <w:t xml:space="preserve"> — idle chatter. Additional shevachim (</w:t>
+      </w:r>
+      <w:r>
+        <w:rPr>
+          <w:rFonts w:ascii="David" w:hAnsi="David"/>
+        </w:rPr>
+        <w:t>שְׁבָחִים</w:t>
+      </w:r>
+      <w:r>
+        <w:rPr>
+          <w:rFonts w:ascii="David" w:hAnsi="David"/>
+        </w:rPr>
+        <w:t>) of the ריבונו של עולם, such as שיר המעלות, are in a different category and are permissible. The klal Yisrael has largely accepted the minhag.</w:t>
         <w:br/>
       </w:r>
     </w:p>
@@ -1742,7 +1945,16 @@
     <w:p>
       <w:r>
         <w:br/>
-        <w:t xml:space="preserve">  In practical halacha there is a </w:t>
+        <w:t xml:space="preserve">  In practical halacha (</w:t>
+      </w:r>
+      <w:r>
+        <w:rPr>
+          <w:rFonts w:ascii="David" w:hAnsi="David"/>
+        </w:rPr>
+        <w:t>הֲלָכָה</w:t>
+      </w:r>
+      <w:r>
+        <w:t xml:space="preserve">) there is a </w:t>
       </w:r>
       <w:r>
         <w:rPr>
@@ -1751,10 +1963,19 @@
         <w:t>קפידא גדולה</w:t>
       </w:r>
       <w:r>
-        <w:rPr>
-          <w:rFonts w:ascii="David" w:hAnsi="David"/>
-        </w:rPr>
-        <w:t xml:space="preserve"> in the poskim, discussed at length in the משנה ברורה,</w:t>
+        <w:t xml:space="preserve"> in the poskim (</w:t>
+      </w:r>
+      <w:r>
+        <w:rPr>
+          <w:rFonts w:ascii="David" w:hAnsi="David"/>
+        </w:rPr>
+        <w:t>פּוֹסְקִים</w:t>
+      </w:r>
+      <w:r>
+        <w:rPr>
+          <w:rFonts w:ascii="David" w:hAnsi="David"/>
+        </w:rPr>
+        <w:t>), discussed at length in the משנה ברורה,</w:t>
       </w:r>
       <w:r>
         <w:rPr>
@@ -1781,7 +2002,20 @@
         <w:rPr>
           <w:i/>
         </w:rPr>
-        <w:t>shva</w:t>
+        <w:t>shva (</w:t>
+      </w:r>
+      <w:r>
+        <w:rPr>
+          <w:rFonts w:ascii="David" w:hAnsi="David"/>
+          <w:i/>
+        </w:rPr>
+        <w:t>שְׁוָא</w:t>
+      </w:r>
+      <w:r>
+        <w:rPr>
+          <w:i/>
+        </w:rPr>
+        <w:t>)</w:t>
       </w:r>
       <w:r>
         <w:t xml:space="preserve"> — and not </w:t>
@@ -1800,7 +2034,20 @@
         <w:rPr>
           <w:i/>
         </w:rPr>
-        <w:t>patach</w:t>
+        <w:t>patach (</w:t>
+      </w:r>
+      <w:r>
+        <w:rPr>
+          <w:rFonts w:ascii="David" w:hAnsi="David"/>
+          <w:i/>
+        </w:rPr>
+        <w:t>פַּתָּח</w:t>
+      </w:r>
+      <w:r>
+        <w:rPr>
+          <w:i/>
+        </w:rPr>
+        <w:t>)</w:t>
       </w:r>
       <w:r>
         <w:rPr>
@@ -1841,7 +2088,16 @@
         <w:t>ב"ח</w:t>
       </w:r>
       <w:r>
-        <w:t xml:space="preserve"> (Rav Yoel Sirkis) asks a kasha:</w:t>
+        <w:t xml:space="preserve"> (Rav Yoel Sirkis) asks a kasha (</w:t>
+      </w:r>
+      <w:r>
+        <w:rPr>
+          <w:rFonts w:ascii="David" w:hAnsi="David"/>
+        </w:rPr>
+        <w:t>קֻשְׁיָא</w:t>
+      </w:r>
+      <w:r>
+        <w:t>):</w:t>
       </w:r>
       <w:r>
         <w:rPr>
@@ -2086,7 +2342,25 @@
         <w:t>[22]</w:t>
       </w:r>
       <w:r>
-        <w:t xml:space="preserve"> The old minhag was that a mechaber embedded his name in the piece he composed — Rabbi Akiva's signature is in the gematria itself.</w:t>
+        <w:t xml:space="preserve"> The old minhag was that a mechaber (</w:t>
+      </w:r>
+      <w:r>
+        <w:rPr>
+          <w:rFonts w:ascii="David" w:hAnsi="David"/>
+        </w:rPr>
+        <w:t>מְחַבֵּר</w:t>
+      </w:r>
+      <w:r>
+        <w:t>) embedded his name in the piece he composed — Rabbi Akiva's signature is in the gematria (</w:t>
+      </w:r>
+      <w:r>
+        <w:rPr>
+          <w:rFonts w:ascii="David" w:hAnsi="David"/>
+        </w:rPr>
+        <w:t>גִּימַטְרִיָּא</w:t>
+      </w:r>
+      <w:r>
+        <w:t>) itself.</w:t>
         <w:br/>
       </w:r>
     </w:p>
@@ -2107,7 +2381,19 @@
           <w:rFonts w:ascii="David" w:hAnsi="David"/>
         </w:rPr>
         <w:br/>
-        <w:t xml:space="preserve">  If one reads אָבִינוּ מַלְכֵּנוּ carefully, its brachos correspond — not one-to-one, but strikingly — to the middle brachos of שמונה עשרה. So even on ראש השנה, when we do </w:t>
+        <w:t xml:space="preserve">  If one reads אָבִינוּ מַלְכֵּנוּ carefully, its brachos (</w:t>
+      </w:r>
+      <w:r>
+        <w:rPr>
+          <w:rFonts w:ascii="David" w:hAnsi="David"/>
+        </w:rPr>
+        <w:t>בְּרָכוֹת</w:t>
+      </w:r>
+      <w:r>
+        <w:rPr>
+          <w:rFonts w:ascii="David" w:hAnsi="David"/>
+        </w:rPr>
+        <w:t xml:space="preserve">) correspond — not one-to-one, but strikingly — to the middle brachos of שמונה עשרה. So even on ראש השנה, when we do </w:t>
       </w:r>
       <w:r>
         <w:rPr>
@@ -2119,7 +2405,19 @@
         <w:rPr>
           <w:rFonts w:ascii="David" w:hAnsi="David"/>
         </w:rPr>
-        <w:t xml:space="preserve"> say the weekday שמונה עשרה of בקשה, we still voice the essential middle-bracha בקשות (חיים, פרנסה, סליחה) through אָבִינוּ מַלְכֵּנוּ. This is why the amida on ראש השנה is followed by אָבִינוּ מַלְכֵּנוּ: the day is </w:t>
+        <w:t xml:space="preserve"> say the weekday שמונה עשרה of בקשה, we still voice the essential middle-bracha בקשות (חיים, פרנסה, סליחה) through אָבִינוּ מַלְכֵּנוּ. This is why the amida (</w:t>
+      </w:r>
+      <w:r>
+        <w:rPr>
+          <w:rFonts w:ascii="David" w:hAnsi="David"/>
+        </w:rPr>
+        <w:t>עֲמִידָה</w:t>
+      </w:r>
+      <w:r>
+        <w:rPr>
+          <w:rFonts w:ascii="David" w:hAnsi="David"/>
+        </w:rPr>
+        <w:t xml:space="preserve">) on ראש השנה is followed by אָבִינוּ מַלְכֵּנוּ: the day is </w:t>
       </w:r>
       <w:r>
         <w:rPr>
@@ -2229,7 +2527,28 @@
         <w:rPr>
           <w:rFonts w:ascii="David" w:hAnsi="David"/>
         </w:rPr>
-        <w:t xml:space="preserve"> — danced with all his might before the אָרוֹן. To dance with the תורה like a small child, without self-consciousness, in pure שמחה over the matanah הקדוש ברוך הוא has given us — is a tremendous kli.</w:t>
+        <w:t xml:space="preserve"> — danced with all his might before the אָרוֹן. To dance with the תורה like a small child, without self-consciousness, in pure שמחה over the matanah (</w:t>
+      </w:r>
+      <w:r>
+        <w:rPr>
+          <w:rFonts w:ascii="David" w:hAnsi="David"/>
+        </w:rPr>
+        <w:t>מַתָּנָה</w:t>
+      </w:r>
+      <w:r>
+        <w:rPr>
+          <w:rFonts w:ascii="David" w:hAnsi="David"/>
+        </w:rPr>
+        <w:t>) הקדוש ברוך הוא has given us — is a tremendous kli (</w:t>
+      </w:r>
+      <w:r>
+        <w:rPr>
+          <w:rFonts w:ascii="David" w:hAnsi="David"/>
+        </w:rPr>
+        <w:t>כְּלִי</w:t>
+      </w:r>
+      <w:r>
+        <w:t>).</w:t>
         <w:br/>
       </w:r>
     </w:p>
@@ -2239,7 +2558,19 @@
           <w:rFonts w:ascii="David" w:hAnsi="David"/>
         </w:rPr>
         <w:br/>
-        <w:t xml:space="preserve">  The Rav has personally seen it: a man who was struggling with פרנסה took the eitzah to heart, danced on שמחת תורה with abandon, and shortly after saw his business flourish.</w:t>
+        <w:t xml:space="preserve">  The Rav has personally seen it: a man who was struggling with פרנסה took the eitzah (</w:t>
+      </w:r>
+      <w:r>
+        <w:rPr>
+          <w:rFonts w:ascii="David" w:hAnsi="David"/>
+        </w:rPr>
+        <w:t>עֵצָה</w:t>
+      </w:r>
+      <w:r>
+        <w:rPr>
+          <w:rFonts w:ascii="David" w:hAnsi="David"/>
+        </w:rPr>
+        <w:t>) to heart, danced on שמחת תורה with abandon, and shortly after saw his business flourish.</w:t>
         <w:br/>
       </w:r>
     </w:p>

</xml_diff>